<commit_message>
docs: update API doc - enhanced get_price_list_items response & add Transaction History section
- get_price_list_items now shows: default_uom, uoms with conversion_factor & rate,
  mrp, standard_selling_price, last_customer_rate, available_qty
- New Section 16: Transaction History (SO/SI/Return by item/customer/doctype)
  with filter examples and full response sample

Co-Authored-By: Claude Opus 4.6 (1M context) <noreply@anthropic.com>
</commit_message>
<xml_diff>
--- a/Basket4Me_PWA_API_Reference_V3.docx
+++ b/Basket4Me_PWA_API_Reference_V3.docx
@@ -282,6 +282,17 @@
           <w:sz w:val="22"/>
         </w:rPr>
         <w:t>15. Shift Management (3 endpoints)</w:t>
+      </w:r>
+    </w:p>
+    <w:p>
+      <w:pPr>
+        <w:spacing w:after="80"/>
+      </w:pPr>
+      <w:r>
+        <w:rPr>
+          <w:sz w:val="22"/>
+        </w:rPr>
+        <w:t>16. Transaction History (1 endpoint)</w:t>
       </w:r>
     </w:p>
     <w:p/>
@@ -11572,7 +11583,7 @@
           <w:i/>
           <w:sz w:val="18"/>
         </w:rPr>
-        <w:t>Get items in a specific price list with search and pagination.</w:t>
+        <w:t>Get items in a specific price list with enhanced details: default UOM, all UOMs with conversion factor &amp; rate, MRP, standard selling price, last customer rate, and available stock qty.</w:t>
       </w:r>
     </w:p>
     <w:p>
@@ -11917,7 +11928,7 @@
                 <w:b w:val="0"/>
                 <w:sz w:val="18"/>
               </w:rPr>
-              <w:t>Filter by price list item name</w:t>
+              <w:t>Alias for item_code filter</w:t>
             </w:r>
           </w:p>
         </w:tc>
@@ -11979,7 +11990,7 @@
                 <w:b w:val="0"/>
                 <w:sz w:val="18"/>
               </w:rPr>
-              <w:t>General search across name, item_code, item_name</w:t>
+              <w:t>Search across item_code and item_name</w:t>
             </w:r>
           </w:p>
         </w:tc>
@@ -11997,7 +12008,7 @@
                 <w:b w:val="0"/>
                 <w:sz w:val="18"/>
               </w:rPr>
-              <w:t>page_number</w:t>
+              <w:t>customer</w:t>
             </w:r>
           </w:p>
         </w:tc>
@@ -12013,7 +12024,7 @@
                 <w:b w:val="0"/>
                 <w:sz w:val="18"/>
               </w:rPr>
-              <w:t>Int</w:t>
+              <w:t>String</w:t>
             </w:r>
           </w:p>
         </w:tc>
@@ -12045,7 +12056,7 @@
                 <w:b w:val="0"/>
                 <w:sz w:val="18"/>
               </w:rPr>
-              <w:t>Page number (default: 1)</w:t>
+              <w:t>Customer name (for last customer rate)</w:t>
             </w:r>
           </w:p>
         </w:tc>
@@ -12062,6 +12073,69 @@
                 <w:b w:val="0"/>
                 <w:sz w:val="18"/>
               </w:rPr>
+              <w:t>page_number</w:t>
+            </w:r>
+          </w:p>
+        </w:tc>
+        <w:tc>
+          <w:tcPr>
+            <w:tcW w:type="dxa" w:w="2160"/>
+          </w:tcPr>
+          <w:p>
+            <w:r/>
+            <w:r>
+              <w:rPr>
+                <w:b w:val="0"/>
+                <w:sz w:val="18"/>
+              </w:rPr>
+              <w:t>Int</w:t>
+            </w:r>
+          </w:p>
+        </w:tc>
+        <w:tc>
+          <w:tcPr>
+            <w:tcW w:type="dxa" w:w="2160"/>
+          </w:tcPr>
+          <w:p>
+            <w:r/>
+            <w:r>
+              <w:rPr>
+                <w:b w:val="0"/>
+                <w:sz w:val="18"/>
+              </w:rPr>
+              <w:t>No</w:t>
+            </w:r>
+          </w:p>
+        </w:tc>
+        <w:tc>
+          <w:tcPr>
+            <w:tcW w:type="dxa" w:w="2160"/>
+          </w:tcPr>
+          <w:p>
+            <w:r/>
+            <w:r>
+              <w:rPr>
+                <w:b w:val="0"/>
+                <w:sz w:val="18"/>
+              </w:rPr>
+              <w:t>Page number (default: 1)</w:t>
+            </w:r>
+          </w:p>
+        </w:tc>
+      </w:tr>
+      <w:tr>
+        <w:tc>
+          <w:tcPr>
+            <w:tcW w:type="dxa" w:w="2160"/>
+            <w:shd w:fill="F2F7FB"/>
+          </w:tcPr>
+          <w:p>
+            <w:r/>
+            <w:r>
+              <w:rPr>
+                <w:b w:val="0"/>
+                <w:sz w:val="18"/>
+              </w:rPr>
               <w:t>page_size</w:t>
             </w:r>
           </w:p>
@@ -12069,6 +12143,7 @@
         <w:tc>
           <w:tcPr>
             <w:tcW w:type="dxa" w:w="2160"/>
+            <w:shd w:fill="F2F7FB"/>
           </w:tcPr>
           <w:p>
             <w:r/>
@@ -12084,6 +12159,7 @@
         <w:tc>
           <w:tcPr>
             <w:tcW w:type="dxa" w:w="2160"/>
+            <w:shd w:fill="F2F7FB"/>
           </w:tcPr>
           <w:p>
             <w:r/>
@@ -12099,6 +12175,7 @@
         <w:tc>
           <w:tcPr>
             <w:tcW w:type="dxa" w:w="2160"/>
+            <w:shd w:fill="F2F7FB"/>
           </w:tcPr>
           <w:p>
             <w:r/>
@@ -12134,35 +12211,81 @@
         </w:rPr>
         <w:t>{</w:t>
         <w:br/>
-        <w:t xml:space="preserve">  "message": {</w:t>
-        <w:br/>
-        <w:t xml:space="preserve">    "data": [</w:t>
+        <w:t xml:space="preserve">  "message": "Price List items fetched",</w:t>
+        <w:br/>
+        <w:t xml:space="preserve">  "data": {</w:t>
+        <w:br/>
+        <w:t xml:space="preserve">    "items": [</w:t>
         <w:br/>
         <w:t xml:space="preserve">      {</w:t>
         <w:br/>
-        <w:t xml:space="preserve">        "name": "IPRICE-001",</w:t>
-        <w:br/>
-        <w:t xml:space="preserve">        "item_code": "ITEM-0001",</w:t>
-        <w:br/>
-        <w:t xml:space="preserve">        "item_name": "Mineral Water 500ml",</w:t>
-        <w:br/>
-        <w:t xml:space="preserve">        "price_list_rate": 1.25,</w:t>
-        <w:br/>
-        <w:t xml:space="preserve">        "currency": "SAR",</w:t>
-        <w:br/>
-        <w:t xml:space="preserve">        "uom": "Nos"</w:t>
+        <w:t xml:space="preserve">        "name": "3ng497r8pn",</w:t>
+        <w:br/>
+        <w:t xml:space="preserve">        "item_code": "AF00890",</w:t>
+        <w:br/>
+        <w:t xml:space="preserve">        "item_name": "B Unibic Cashew Rs.10*192",</w:t>
+        <w:br/>
+        <w:t xml:space="preserve">        "uom": "Nos",</w:t>
+        <w:br/>
+        <w:t xml:space="preserve">        "price_list_rate": 108.0,</w:t>
+        <w:br/>
+        <w:t xml:space="preserve">        "currency": "INR",</w:t>
+        <w:br/>
+        <w:t xml:space="preserve">        "valid_from": "2025-06-19",</w:t>
+        <w:br/>
+        <w:t xml:space="preserve">        "valid_upto": null,</w:t>
+        <w:br/>
+        <w:t xml:space="preserve">        "batch_no": null,</w:t>
+        <w:br/>
+        <w:t xml:space="preserve">        "default_uom": "Nos",</w:t>
+        <w:br/>
+        <w:t xml:space="preserve">        "uoms": [</w:t>
+        <w:br/>
+        <w:t xml:space="preserve">          {</w:t>
+        <w:br/>
+        <w:t xml:space="preserve">            "uom": "Nos",</w:t>
+        <w:br/>
+        <w:t xml:space="preserve">            "conversion_factor": 1.0,</w:t>
+        <w:br/>
+        <w:t xml:space="preserve">            "rate": 106.8</w:t>
+        <w:br/>
+        <w:t xml:space="preserve">          },</w:t>
+        <w:br/>
+        <w:t xml:space="preserve">          {</w:t>
+        <w:br/>
+        <w:t xml:space="preserve">            "uom": "Box",</w:t>
+        <w:br/>
+        <w:t xml:space="preserve">            "conversion_factor": 192.0,</w:t>
+        <w:br/>
+        <w:t xml:space="preserve">            "rate": 20505.6</w:t>
+        <w:br/>
+        <w:t xml:space="preserve">          }</w:t>
+        <w:br/>
+        <w:t xml:space="preserve">        ],</w:t>
+        <w:br/>
+        <w:t xml:space="preserve">        "mrp": 10.0,</w:t>
+        <w:br/>
+        <w:t xml:space="preserve">        "standard_selling_price": 106.8,</w:t>
+        <w:br/>
+        <w:t xml:space="preserve">        "last_customer_rate": 106.8,</w:t>
+        <w:br/>
+        <w:t xml:space="preserve">        "available_qty": 54.0</w:t>
         <w:br/>
         <w:t xml:space="preserve">      }</w:t>
         <w:br/>
         <w:t xml:space="preserve">    ],</w:t>
         <w:br/>
-        <w:t xml:space="preserve">    "total_count": 150,</w:t>
+        <w:t xml:space="preserve">    "price_list": "Standard Selling",</w:t>
+        <w:br/>
+        <w:t xml:space="preserve">    "total_count": 2283,</w:t>
         <w:br/>
         <w:t xml:space="preserve">    "page_number": 1,</w:t>
         <w:br/>
         <w:t xml:space="preserve">    "page_size": 50</w:t>
         <w:br/>
-        <w:t xml:space="preserve">  }</w:t>
+        <w:t xml:space="preserve">  },</w:t>
+        <w:br/>
+        <w:t xml:space="preserve">  "success": true</w:t>
         <w:br/>
         <w:t>}</w:t>
       </w:r>
@@ -33502,6 +33625,1186 @@
         <w:t>__________________________________________________________________________________________</w:t>
       </w:r>
     </w:p>
+    <w:p>
+      <w:r>
+        <w:br w:type="page"/>
+      </w:r>
+    </w:p>
+    <w:p>
+      <w:pPr>
+        <w:pStyle w:val="Heading1"/>
+      </w:pPr>
+      <w:r>
+        <w:t>Section 16: Transaction History</w:t>
+      </w:r>
+    </w:p>
+    <w:tbl>
+      <w:tblPr>
+        <w:tblStyle w:val="TableGrid"/>
+        <w:tblW w:type="auto" w:w="0"/>
+        <w:jc w:val="left"/>
+        <w:tblLook w:firstColumn="1" w:firstRow="1" w:lastColumn="0" w:lastRow="0" w:noHBand="0" w:noVBand="1" w:val="04A0"/>
+      </w:tblPr>
+      <w:tblGrid>
+        <w:gridCol w:w="2160"/>
+        <w:gridCol w:w="2160"/>
+        <w:gridCol w:w="2160"/>
+        <w:gridCol w:w="2160"/>
+      </w:tblGrid>
+      <w:tr>
+        <w:tc>
+          <w:tcPr>
+            <w:tcW w:type="dxa" w:w="2160"/>
+            <w:shd w:fill="2E75B6"/>
+          </w:tcPr>
+          <w:p>
+            <w:r/>
+            <w:r>
+              <w:rPr>
+                <w:b/>
+                <w:color w:val="FFFFFF"/>
+                <w:sz w:val="18"/>
+              </w:rPr>
+              <w:t>#</w:t>
+            </w:r>
+          </w:p>
+        </w:tc>
+        <w:tc>
+          <w:tcPr>
+            <w:tcW w:type="dxa" w:w="2160"/>
+            <w:shd w:fill="2E75B6"/>
+          </w:tcPr>
+          <w:p>
+            <w:r/>
+            <w:r>
+              <w:rPr>
+                <w:b/>
+                <w:color w:val="FFFFFF"/>
+                <w:sz w:val="18"/>
+              </w:rPr>
+              <w:t>Endpoint Path</w:t>
+            </w:r>
+          </w:p>
+        </w:tc>
+        <w:tc>
+          <w:tcPr>
+            <w:tcW w:type="dxa" w:w="2160"/>
+            <w:shd w:fill="2E75B6"/>
+          </w:tcPr>
+          <w:p>
+            <w:r/>
+            <w:r>
+              <w:rPr>
+                <w:b/>
+                <w:color w:val="FFFFFF"/>
+                <w:sz w:val="18"/>
+              </w:rPr>
+              <w:t>Method</w:t>
+            </w:r>
+          </w:p>
+        </w:tc>
+        <w:tc>
+          <w:tcPr>
+            <w:tcW w:type="dxa" w:w="2160"/>
+            <w:shd w:fill="2E75B6"/>
+          </w:tcPr>
+          <w:p>
+            <w:r/>
+            <w:r>
+              <w:rPr>
+                <w:b/>
+                <w:color w:val="FFFFFF"/>
+                <w:sz w:val="18"/>
+              </w:rPr>
+              <w:t>Description</w:t>
+            </w:r>
+          </w:p>
+        </w:tc>
+      </w:tr>
+      <w:tr>
+        <w:tc>
+          <w:tcPr>
+            <w:tcW w:type="dxa" w:w="2160"/>
+          </w:tcPr>
+          <w:p>
+            <w:r/>
+            <w:r>
+              <w:rPr>
+                <w:b w:val="0"/>
+                <w:sz w:val="18"/>
+              </w:rPr>
+              <w:t>1</w:t>
+            </w:r>
+          </w:p>
+        </w:tc>
+        <w:tc>
+          <w:tcPr>
+            <w:tcW w:type="dxa" w:w="2160"/>
+          </w:tcPr>
+          <w:p>
+            <w:r/>
+            <w:r>
+              <w:rPr>
+                <w:b w:val="0"/>
+                <w:sz w:val="18"/>
+              </w:rPr>
+              <w:t>/api/method/basket4me_pwa.api.get_transaction_history</w:t>
+            </w:r>
+          </w:p>
+        </w:tc>
+        <w:tc>
+          <w:tcPr>
+            <w:tcW w:type="dxa" w:w="2160"/>
+          </w:tcPr>
+          <w:p>
+            <w:r/>
+            <w:r>
+              <w:rPr>
+                <w:b w:val="0"/>
+                <w:sz w:val="18"/>
+              </w:rPr>
+              <w:t>GET</w:t>
+            </w:r>
+          </w:p>
+        </w:tc>
+        <w:tc>
+          <w:tcPr>
+            <w:tcW w:type="dxa" w:w="2160"/>
+          </w:tcPr>
+          <w:p>
+            <w:r/>
+            <w:r>
+              <w:rPr>
+                <w:b w:val="0"/>
+                <w:sz w:val="18"/>
+              </w:rPr>
+              <w:t>Get combined transaction history (SO/SI/Return) by item, customer, or doctype</w:t>
+            </w:r>
+          </w:p>
+        </w:tc>
+      </w:tr>
+    </w:tbl>
+    <w:p/>
+    <w:p>
+      <w:r>
+        <w:rPr>
+          <w:b/>
+          <w:color w:val="2D8B4E"/>
+          <w:sz w:val="20"/>
+        </w:rPr>
+        <w:t xml:space="preserve">  GET  </w:t>
+      </w:r>
+      <w:r>
+        <w:rPr>
+          <w:rFonts w:ascii="Consolas" w:hAnsi="Consolas"/>
+          <w:color w:val="1B3A5C"/>
+          <w:sz w:val="18"/>
+        </w:rPr>
+        <w:t xml:space="preserve">  https://devassociate.frappe.cloud/api/method/basket4me_pwa.api.get_transaction_history</w:t>
+      </w:r>
+    </w:p>
+    <w:p>
+      <w:r>
+        <w:rPr>
+          <w:i/>
+          <w:sz w:val="18"/>
+        </w:rPr>
+        <w:t>Get transaction history across Sales Orders, Sales Invoices, and Sales Returns. Filter by item, customer, doctype, and date range. Returns per-line details with summary totals.</w:t>
+      </w:r>
+    </w:p>
+    <w:p>
+      <w:pPr>
+        <w:pStyle w:val="ListBullet"/>
+      </w:pPr>
+      <w:r>
+        <w:t>Parameters:</w:t>
+      </w:r>
+    </w:p>
+    <w:tbl>
+      <w:tblPr>
+        <w:tblStyle w:val="TableGrid"/>
+        <w:tblW w:type="auto" w:w="0"/>
+        <w:jc w:val="left"/>
+        <w:tblLook w:firstColumn="1" w:firstRow="1" w:lastColumn="0" w:lastRow="0" w:noHBand="0" w:noVBand="1" w:val="04A0"/>
+      </w:tblPr>
+      <w:tblGrid>
+        <w:gridCol w:w="2160"/>
+        <w:gridCol w:w="2160"/>
+        <w:gridCol w:w="2160"/>
+        <w:gridCol w:w="2160"/>
+      </w:tblGrid>
+      <w:tr>
+        <w:tc>
+          <w:tcPr>
+            <w:tcW w:type="dxa" w:w="2160"/>
+            <w:shd w:fill="2D8B4E"/>
+          </w:tcPr>
+          <w:p>
+            <w:r/>
+            <w:r>
+              <w:rPr>
+                <w:b/>
+                <w:color w:val="FFFFFF"/>
+                <w:sz w:val="18"/>
+              </w:rPr>
+              <w:t>Parameter</w:t>
+            </w:r>
+          </w:p>
+        </w:tc>
+        <w:tc>
+          <w:tcPr>
+            <w:tcW w:type="dxa" w:w="2160"/>
+            <w:shd w:fill="2D8B4E"/>
+          </w:tcPr>
+          <w:p>
+            <w:r/>
+            <w:r>
+              <w:rPr>
+                <w:b/>
+                <w:color w:val="FFFFFF"/>
+                <w:sz w:val="18"/>
+              </w:rPr>
+              <w:t>Type</w:t>
+            </w:r>
+          </w:p>
+        </w:tc>
+        <w:tc>
+          <w:tcPr>
+            <w:tcW w:type="dxa" w:w="2160"/>
+            <w:shd w:fill="2D8B4E"/>
+          </w:tcPr>
+          <w:p>
+            <w:r/>
+            <w:r>
+              <w:rPr>
+                <w:b/>
+                <w:color w:val="FFFFFF"/>
+                <w:sz w:val="18"/>
+              </w:rPr>
+              <w:t>Required</w:t>
+            </w:r>
+          </w:p>
+        </w:tc>
+        <w:tc>
+          <w:tcPr>
+            <w:tcW w:type="dxa" w:w="2160"/>
+            <w:shd w:fill="2D8B4E"/>
+          </w:tcPr>
+          <w:p>
+            <w:r/>
+            <w:r>
+              <w:rPr>
+                <w:b/>
+                <w:color w:val="FFFFFF"/>
+                <w:sz w:val="18"/>
+              </w:rPr>
+              <w:t>Description</w:t>
+            </w:r>
+          </w:p>
+        </w:tc>
+      </w:tr>
+      <w:tr>
+        <w:tc>
+          <w:tcPr>
+            <w:tcW w:type="dxa" w:w="2160"/>
+          </w:tcPr>
+          <w:p>
+            <w:r/>
+            <w:r>
+              <w:rPr>
+                <w:b w:val="0"/>
+                <w:sz w:val="18"/>
+              </w:rPr>
+              <w:t>item_code</w:t>
+            </w:r>
+          </w:p>
+        </w:tc>
+        <w:tc>
+          <w:tcPr>
+            <w:tcW w:type="dxa" w:w="2160"/>
+          </w:tcPr>
+          <w:p>
+            <w:r/>
+            <w:r>
+              <w:rPr>
+                <w:b w:val="0"/>
+                <w:sz w:val="18"/>
+              </w:rPr>
+              <w:t>String</w:t>
+            </w:r>
+          </w:p>
+        </w:tc>
+        <w:tc>
+          <w:tcPr>
+            <w:tcW w:type="dxa" w:w="2160"/>
+          </w:tcPr>
+          <w:p>
+            <w:r/>
+            <w:r>
+              <w:rPr>
+                <w:b w:val="0"/>
+                <w:sz w:val="18"/>
+              </w:rPr>
+              <w:t>Conditional</w:t>
+            </w:r>
+          </w:p>
+        </w:tc>
+        <w:tc>
+          <w:tcPr>
+            <w:tcW w:type="dxa" w:w="2160"/>
+          </w:tcPr>
+          <w:p>
+            <w:r/>
+            <w:r>
+              <w:rPr>
+                <w:b w:val="0"/>
+                <w:sz w:val="18"/>
+              </w:rPr>
+              <w:t>Filter by item code (item_code or customer required)</w:t>
+            </w:r>
+          </w:p>
+        </w:tc>
+      </w:tr>
+      <w:tr>
+        <w:tc>
+          <w:tcPr>
+            <w:tcW w:type="dxa" w:w="2160"/>
+            <w:shd w:fill="F2F7FB"/>
+          </w:tcPr>
+          <w:p>
+            <w:r/>
+            <w:r>
+              <w:rPr>
+                <w:b w:val="0"/>
+                <w:sz w:val="18"/>
+              </w:rPr>
+              <w:t>customer</w:t>
+            </w:r>
+          </w:p>
+        </w:tc>
+        <w:tc>
+          <w:tcPr>
+            <w:tcW w:type="dxa" w:w="2160"/>
+            <w:shd w:fill="F2F7FB"/>
+          </w:tcPr>
+          <w:p>
+            <w:r/>
+            <w:r>
+              <w:rPr>
+                <w:b w:val="0"/>
+                <w:sz w:val="18"/>
+              </w:rPr>
+              <w:t>String</w:t>
+            </w:r>
+          </w:p>
+        </w:tc>
+        <w:tc>
+          <w:tcPr>
+            <w:tcW w:type="dxa" w:w="2160"/>
+            <w:shd w:fill="F2F7FB"/>
+          </w:tcPr>
+          <w:p>
+            <w:r/>
+            <w:r>
+              <w:rPr>
+                <w:b w:val="0"/>
+                <w:sz w:val="18"/>
+              </w:rPr>
+              <w:t>Conditional</w:t>
+            </w:r>
+          </w:p>
+        </w:tc>
+        <w:tc>
+          <w:tcPr>
+            <w:tcW w:type="dxa" w:w="2160"/>
+            <w:shd w:fill="F2F7FB"/>
+          </w:tcPr>
+          <w:p>
+            <w:r/>
+            <w:r>
+              <w:rPr>
+                <w:b w:val="0"/>
+                <w:sz w:val="18"/>
+              </w:rPr>
+              <w:t>Filter by customer (item_code or customer required)</w:t>
+            </w:r>
+          </w:p>
+        </w:tc>
+      </w:tr>
+      <w:tr>
+        <w:tc>
+          <w:tcPr>
+            <w:tcW w:type="dxa" w:w="2160"/>
+          </w:tcPr>
+          <w:p>
+            <w:r/>
+            <w:r>
+              <w:rPr>
+                <w:b w:val="0"/>
+                <w:sz w:val="18"/>
+              </w:rPr>
+              <w:t>doctype</w:t>
+            </w:r>
+          </w:p>
+        </w:tc>
+        <w:tc>
+          <w:tcPr>
+            <w:tcW w:type="dxa" w:w="2160"/>
+          </w:tcPr>
+          <w:p>
+            <w:r/>
+            <w:r>
+              <w:rPr>
+                <w:b w:val="0"/>
+                <w:sz w:val="18"/>
+              </w:rPr>
+              <w:t>String</w:t>
+            </w:r>
+          </w:p>
+        </w:tc>
+        <w:tc>
+          <w:tcPr>
+            <w:tcW w:type="dxa" w:w="2160"/>
+          </w:tcPr>
+          <w:p>
+            <w:r/>
+            <w:r>
+              <w:rPr>
+                <w:b w:val="0"/>
+                <w:sz w:val="18"/>
+              </w:rPr>
+              <w:t>No</w:t>
+            </w:r>
+          </w:p>
+        </w:tc>
+        <w:tc>
+          <w:tcPr>
+            <w:tcW w:type="dxa" w:w="2160"/>
+          </w:tcPr>
+          <w:p>
+            <w:r/>
+            <w:r>
+              <w:rPr>
+                <w:b w:val="0"/>
+                <w:sz w:val="18"/>
+              </w:rPr>
+              <w:t>'Sales Order', 'Sales Invoice', 'Sales Return', or empty for all</w:t>
+            </w:r>
+          </w:p>
+        </w:tc>
+      </w:tr>
+      <w:tr>
+        <w:tc>
+          <w:tcPr>
+            <w:tcW w:type="dxa" w:w="2160"/>
+            <w:shd w:fill="F2F7FB"/>
+          </w:tcPr>
+          <w:p>
+            <w:r/>
+            <w:r>
+              <w:rPr>
+                <w:b w:val="0"/>
+                <w:sz w:val="18"/>
+              </w:rPr>
+              <w:t>from_date</w:t>
+            </w:r>
+          </w:p>
+        </w:tc>
+        <w:tc>
+          <w:tcPr>
+            <w:tcW w:type="dxa" w:w="2160"/>
+            <w:shd w:fill="F2F7FB"/>
+          </w:tcPr>
+          <w:p>
+            <w:r/>
+            <w:r>
+              <w:rPr>
+                <w:b w:val="0"/>
+                <w:sz w:val="18"/>
+              </w:rPr>
+              <w:t>String</w:t>
+            </w:r>
+          </w:p>
+        </w:tc>
+        <w:tc>
+          <w:tcPr>
+            <w:tcW w:type="dxa" w:w="2160"/>
+            <w:shd w:fill="F2F7FB"/>
+          </w:tcPr>
+          <w:p>
+            <w:r/>
+            <w:r>
+              <w:rPr>
+                <w:b w:val="0"/>
+                <w:sz w:val="18"/>
+              </w:rPr>
+              <w:t>No</w:t>
+            </w:r>
+          </w:p>
+        </w:tc>
+        <w:tc>
+          <w:tcPr>
+            <w:tcW w:type="dxa" w:w="2160"/>
+            <w:shd w:fill="F2F7FB"/>
+          </w:tcPr>
+          <w:p>
+            <w:r/>
+            <w:r>
+              <w:rPr>
+                <w:b w:val="0"/>
+                <w:sz w:val="18"/>
+              </w:rPr>
+              <w:t>Start date (YYYY-MM-DD)</w:t>
+            </w:r>
+          </w:p>
+        </w:tc>
+      </w:tr>
+      <w:tr>
+        <w:tc>
+          <w:tcPr>
+            <w:tcW w:type="dxa" w:w="2160"/>
+          </w:tcPr>
+          <w:p>
+            <w:r/>
+            <w:r>
+              <w:rPr>
+                <w:b w:val="0"/>
+                <w:sz w:val="18"/>
+              </w:rPr>
+              <w:t>to_date</w:t>
+            </w:r>
+          </w:p>
+        </w:tc>
+        <w:tc>
+          <w:tcPr>
+            <w:tcW w:type="dxa" w:w="2160"/>
+          </w:tcPr>
+          <w:p>
+            <w:r/>
+            <w:r>
+              <w:rPr>
+                <w:b w:val="0"/>
+                <w:sz w:val="18"/>
+              </w:rPr>
+              <w:t>String</w:t>
+            </w:r>
+          </w:p>
+        </w:tc>
+        <w:tc>
+          <w:tcPr>
+            <w:tcW w:type="dxa" w:w="2160"/>
+          </w:tcPr>
+          <w:p>
+            <w:r/>
+            <w:r>
+              <w:rPr>
+                <w:b w:val="0"/>
+                <w:sz w:val="18"/>
+              </w:rPr>
+              <w:t>No</w:t>
+            </w:r>
+          </w:p>
+        </w:tc>
+        <w:tc>
+          <w:tcPr>
+            <w:tcW w:type="dxa" w:w="2160"/>
+          </w:tcPr>
+          <w:p>
+            <w:r/>
+            <w:r>
+              <w:rPr>
+                <w:b w:val="0"/>
+                <w:sz w:val="18"/>
+              </w:rPr>
+              <w:t>End date (YYYY-MM-DD)</w:t>
+            </w:r>
+          </w:p>
+        </w:tc>
+      </w:tr>
+      <w:tr>
+        <w:tc>
+          <w:tcPr>
+            <w:tcW w:type="dxa" w:w="2160"/>
+            <w:shd w:fill="F2F7FB"/>
+          </w:tcPr>
+          <w:p>
+            <w:r/>
+            <w:r>
+              <w:rPr>
+                <w:b w:val="0"/>
+                <w:sz w:val="18"/>
+              </w:rPr>
+              <w:t>page_number</w:t>
+            </w:r>
+          </w:p>
+        </w:tc>
+        <w:tc>
+          <w:tcPr>
+            <w:tcW w:type="dxa" w:w="2160"/>
+            <w:shd w:fill="F2F7FB"/>
+          </w:tcPr>
+          <w:p>
+            <w:r/>
+            <w:r>
+              <w:rPr>
+                <w:b w:val="0"/>
+                <w:sz w:val="18"/>
+              </w:rPr>
+              <w:t>Int</w:t>
+            </w:r>
+          </w:p>
+        </w:tc>
+        <w:tc>
+          <w:tcPr>
+            <w:tcW w:type="dxa" w:w="2160"/>
+            <w:shd w:fill="F2F7FB"/>
+          </w:tcPr>
+          <w:p>
+            <w:r/>
+            <w:r>
+              <w:rPr>
+                <w:b w:val="0"/>
+                <w:sz w:val="18"/>
+              </w:rPr>
+              <w:t>No</w:t>
+            </w:r>
+          </w:p>
+        </w:tc>
+        <w:tc>
+          <w:tcPr>
+            <w:tcW w:type="dxa" w:w="2160"/>
+            <w:shd w:fill="F2F7FB"/>
+          </w:tcPr>
+          <w:p>
+            <w:r/>
+            <w:r>
+              <w:rPr>
+                <w:b w:val="0"/>
+                <w:sz w:val="18"/>
+              </w:rPr>
+              <w:t>Page number (default: 1)</w:t>
+            </w:r>
+          </w:p>
+        </w:tc>
+      </w:tr>
+      <w:tr>
+        <w:tc>
+          <w:tcPr>
+            <w:tcW w:type="dxa" w:w="2160"/>
+          </w:tcPr>
+          <w:p>
+            <w:r/>
+            <w:r>
+              <w:rPr>
+                <w:b w:val="0"/>
+                <w:sz w:val="18"/>
+              </w:rPr>
+              <w:t>page_size</w:t>
+            </w:r>
+          </w:p>
+        </w:tc>
+        <w:tc>
+          <w:tcPr>
+            <w:tcW w:type="dxa" w:w="2160"/>
+          </w:tcPr>
+          <w:p>
+            <w:r/>
+            <w:r>
+              <w:rPr>
+                <w:b w:val="0"/>
+                <w:sz w:val="18"/>
+              </w:rPr>
+              <w:t>Int</w:t>
+            </w:r>
+          </w:p>
+        </w:tc>
+        <w:tc>
+          <w:tcPr>
+            <w:tcW w:type="dxa" w:w="2160"/>
+          </w:tcPr>
+          <w:p>
+            <w:r/>
+            <w:r>
+              <w:rPr>
+                <w:b w:val="0"/>
+                <w:sz w:val="18"/>
+              </w:rPr>
+              <w:t>No</w:t>
+            </w:r>
+          </w:p>
+        </w:tc>
+        <w:tc>
+          <w:tcPr>
+            <w:tcW w:type="dxa" w:w="2160"/>
+          </w:tcPr>
+          <w:p>
+            <w:r/>
+            <w:r>
+              <w:rPr>
+                <w:b w:val="0"/>
+                <w:sz w:val="18"/>
+              </w:rPr>
+              <w:t>Results per page (default: 20)</w:t>
+            </w:r>
+          </w:p>
+        </w:tc>
+      </w:tr>
+    </w:tbl>
+    <w:p>
+      <w:r>
+        <w:rPr>
+          <w:b/>
+          <w:sz w:val="20"/>
+        </w:rPr>
+        <w:t>Response:</w:t>
+      </w:r>
+    </w:p>
+    <w:p>
+      <w:pPr>
+        <w:spacing w:before="40" w:after="120"/>
+      </w:pPr>
+      <w:r>
+        <w:rPr>
+          <w:rFonts w:ascii="Consolas" w:hAnsi="Consolas"/>
+          <w:color w:val="333333"/>
+          <w:sz w:val="16"/>
+        </w:rPr>
+        <w:t>{</w:t>
+        <w:br/>
+        <w:t xml:space="preserve">  "message": "Transaction history fetched",</w:t>
+        <w:br/>
+        <w:t xml:space="preserve">  "data": {</w:t>
+        <w:br/>
+        <w:t xml:space="preserve">    "transactions": [</w:t>
+        <w:br/>
+        <w:t xml:space="preserve">      {</w:t>
+        <w:br/>
+        <w:t xml:space="preserve">        "ref_no": "DA-A2526-14448",</w:t>
+        <w:br/>
+        <w:t xml:space="preserve">        "doc_type": "Sales Invoice",</w:t>
+        <w:br/>
+        <w:t xml:space="preserve">        "transaction_type": "Sales Invoice",</w:t>
+        <w:br/>
+        <w:t xml:space="preserve">        "date": "2026-03-21",</w:t>
+        <w:br/>
+        <w:t xml:space="preserve">        "customer": "Vimal Store Cherthala",</w:t>
+        <w:br/>
+        <w:t xml:space="preserve">        "customer_name": "Vimal Store Cherthala",</w:t>
+        <w:br/>
+        <w:t xml:space="preserve">        "docstatus": 1,</w:t>
+        <w:br/>
+        <w:t xml:space="preserve">        "status": "Paid",</w:t>
+        <w:br/>
+        <w:t xml:space="preserve">        "selling_price_list": "Standard Selling",</w:t>
+        <w:br/>
+        <w:t xml:space="preserve">        "item_code": "AF00890",</w:t>
+        <w:br/>
+        <w:t xml:space="preserve">        "item_name": "B Unibic Cashew Rs.10*192",</w:t>
+        <w:br/>
+        <w:t xml:space="preserve">        "qty": 2.0,</w:t>
+        <w:br/>
+        <w:t xml:space="preserve">        "uom": "Nos",</w:t>
+        <w:br/>
+        <w:t xml:space="preserve">        "stock_uom": "Nos",</w:t>
+        <w:br/>
+        <w:t xml:space="preserve">        "conversion_factor": 1.0,</w:t>
+        <w:br/>
+        <w:t xml:space="preserve">        "rate": 106.8,</w:t>
+        <w:br/>
+        <w:t xml:space="preserve">        "amount": 213.6,</w:t>
+        <w:br/>
+        <w:t xml:space="preserve">        "price_list_rate": 106.8,</w:t>
+        <w:br/>
+        <w:t xml:space="preserve">        "discount_percentage": 0,</w:t>
+        <w:br/>
+        <w:t xml:space="preserve">        "discount_amount": 0</w:t>
+        <w:br/>
+        <w:t xml:space="preserve">      },</w:t>
+        <w:br/>
+        <w:t xml:space="preserve">      {</w:t>
+        <w:br/>
+        <w:t xml:space="preserve">        "ref_no": "DA-SO-2026-01459",</w:t>
+        <w:br/>
+        <w:t xml:space="preserve">        "doc_type": "Sales Order",</w:t>
+        <w:br/>
+        <w:t xml:space="preserve">        "transaction_type": "Sales Order",</w:t>
+        <w:br/>
+        <w:t xml:space="preserve">        "date": "2026-03-17",</w:t>
+        <w:br/>
+        <w:t xml:space="preserve">        "customer": "Vimal Store Cherthala",</w:t>
+        <w:br/>
+        <w:t xml:space="preserve">        "customer_name": "Vimal Store Cherthala",</w:t>
+        <w:br/>
+        <w:t xml:space="preserve">        "docstatus": 1,</w:t>
+        <w:br/>
+        <w:t xml:space="preserve">        "status": "Completed",</w:t>
+        <w:br/>
+        <w:t xml:space="preserve">        "selling_price_list": "Standard Selling",</w:t>
+        <w:br/>
+        <w:t xml:space="preserve">        "item_code": "AF00890",</w:t>
+        <w:br/>
+        <w:t xml:space="preserve">        "item_name": "B Unibic Cashew Rs.10*192",</w:t>
+        <w:br/>
+        <w:t xml:space="preserve">        "qty": 2.0,</w:t>
+        <w:br/>
+        <w:t xml:space="preserve">        "uom": "Nos",</w:t>
+        <w:br/>
+        <w:t xml:space="preserve">        "stock_uom": "Nos",</w:t>
+        <w:br/>
+        <w:t xml:space="preserve">        "conversion_factor": 1.0,</w:t>
+        <w:br/>
+        <w:t xml:space="preserve">        "rate": 106.8,</w:t>
+        <w:br/>
+        <w:t xml:space="preserve">        "amount": 213.6,</w:t>
+        <w:br/>
+        <w:t xml:space="preserve">        "price_list_rate": 106.8,</w:t>
+        <w:br/>
+        <w:t xml:space="preserve">        "discount_percentage": 0,</w:t>
+        <w:br/>
+        <w:t xml:space="preserve">        "discount_amount": 0</w:t>
+        <w:br/>
+        <w:t xml:space="preserve">      },</w:t>
+        <w:br/>
+        <w:t xml:space="preserve">      {</w:t>
+        <w:br/>
+        <w:t xml:space="preserve">        "ref_no": "DA-A2526-14500",</w:t>
+        <w:br/>
+        <w:t xml:space="preserve">        "doc_type": "Sales Invoice",</w:t>
+        <w:br/>
+        <w:t xml:space="preserve">        "transaction_type": "Sales Return",</w:t>
+        <w:br/>
+        <w:t xml:space="preserve">        "date": "2026-03-22",</w:t>
+        <w:br/>
+        <w:t xml:space="preserve">        "customer": "Vimal Store Cherthala",</w:t>
+        <w:br/>
+        <w:t xml:space="preserve">        "customer_name": "Vimal Store Cherthala",</w:t>
+        <w:br/>
+        <w:t xml:space="preserve">        "docstatus": 1,</w:t>
+        <w:br/>
+        <w:t xml:space="preserve">        "status": "Return",</w:t>
+        <w:br/>
+        <w:t xml:space="preserve">        "selling_price_list": "Standard Selling",</w:t>
+        <w:br/>
+        <w:t xml:space="preserve">        "item_code": "AF00890",</w:t>
+        <w:br/>
+        <w:t xml:space="preserve">        "item_name": "B Unibic Cashew Rs.10*192",</w:t>
+        <w:br/>
+        <w:t xml:space="preserve">        "qty": -1.0,</w:t>
+        <w:br/>
+        <w:t xml:space="preserve">        "uom": "Nos",</w:t>
+        <w:br/>
+        <w:t xml:space="preserve">        "stock_uom": "Nos",</w:t>
+        <w:br/>
+        <w:t xml:space="preserve">        "conversion_factor": 1.0,</w:t>
+        <w:br/>
+        <w:t xml:space="preserve">        "rate": 106.8,</w:t>
+        <w:br/>
+        <w:t xml:space="preserve">        "amount": -106.8,</w:t>
+        <w:br/>
+        <w:t xml:space="preserve">        "price_list_rate": 106.8,</w:t>
+        <w:br/>
+        <w:t xml:space="preserve">        "discount_percentage": 0,</w:t>
+        <w:br/>
+        <w:t xml:space="preserve">        "discount_amount": 0</w:t>
+        <w:br/>
+        <w:t xml:space="preserve">      }</w:t>
+        <w:br/>
+        <w:t xml:space="preserve">    ],</w:t>
+        <w:br/>
+        <w:t xml:space="preserve">    "summary": {</w:t>
+        <w:br/>
+        <w:t xml:space="preserve">      "total_qty": 3.0,</w:t>
+        <w:br/>
+        <w:t xml:space="preserve">      "total_amount": 320.4,</w:t>
+        <w:br/>
+        <w:t xml:space="preserve">      "total_discount": 0,</w:t>
+        <w:br/>
+        <w:t xml:space="preserve">      "so_count": 1,</w:t>
+        <w:br/>
+        <w:t xml:space="preserve">      "si_count": 1,</w:t>
+        <w:br/>
+        <w:t xml:space="preserve">      "return_count": 1</w:t>
+        <w:br/>
+        <w:t xml:space="preserve">    },</w:t>
+        <w:br/>
+        <w:t xml:space="preserve">    "total_count": 3,</w:t>
+        <w:br/>
+        <w:t xml:space="preserve">    "page_number": 1,</w:t>
+        <w:br/>
+        <w:t xml:space="preserve">    "page_size": 20</w:t>
+        <w:br/>
+        <w:t xml:space="preserve">  },</w:t>
+        <w:br/>
+        <w:t xml:space="preserve">  "success": true</w:t>
+        <w:br/>
+        <w:t>}</w:t>
+      </w:r>
+    </w:p>
+    <w:p>
+      <w:r>
+        <w:rPr>
+          <w:color w:val="CCCCCC"/>
+          <w:sz w:val="12"/>
+        </w:rPr>
+        <w:t>__________________________________________________________________________________________</w:t>
+      </w:r>
+    </w:p>
+    <w:p/>
+    <w:p>
+      <w:r>
+        <w:rPr>
+          <w:b/>
+          <w:sz w:val="20"/>
+        </w:rPr>
+        <w:t>Filter Examples:</w:t>
+      </w:r>
+    </w:p>
+    <w:tbl>
+      <w:tblPr>
+        <w:tblStyle w:val="TableGrid"/>
+        <w:tblW w:type="auto" w:w="0"/>
+        <w:jc w:val="left"/>
+        <w:tblLook w:firstColumn="1" w:firstRow="1" w:lastColumn="0" w:lastRow="0" w:noHBand="0" w:noVBand="1" w:val="04A0"/>
+      </w:tblPr>
+      <w:tblGrid>
+        <w:gridCol w:w="4320"/>
+        <w:gridCol w:w="4320"/>
+      </w:tblGrid>
+      <w:tr>
+        <w:tc>
+          <w:tcPr>
+            <w:tcW w:type="dxa" w:w="4320"/>
+            <w:shd w:fill="2D8B4E"/>
+          </w:tcPr>
+          <w:p>
+            <w:r/>
+            <w:r>
+              <w:rPr>
+                <w:b/>
+                <w:color w:val="FFFFFF"/>
+                <w:sz w:val="18"/>
+              </w:rPr>
+              <w:t>Filter</w:t>
+            </w:r>
+          </w:p>
+        </w:tc>
+        <w:tc>
+          <w:tcPr>
+            <w:tcW w:type="dxa" w:w="4320"/>
+            <w:shd w:fill="2D8B4E"/>
+          </w:tcPr>
+          <w:p>
+            <w:r/>
+            <w:r>
+              <w:rPr>
+                <w:b/>
+                <w:color w:val="FFFFFF"/>
+                <w:sz w:val="18"/>
+              </w:rPr>
+              <w:t>Query String</w:t>
+            </w:r>
+          </w:p>
+        </w:tc>
+      </w:tr>
+      <w:tr>
+        <w:tc>
+          <w:tcPr>
+            <w:tcW w:type="dxa" w:w="4320"/>
+          </w:tcPr>
+          <w:p>
+            <w:r/>
+            <w:r>
+              <w:rPr>
+                <w:b w:val="0"/>
+                <w:sz w:val="18"/>
+              </w:rPr>
+              <w:t>By Item</w:t>
+            </w:r>
+          </w:p>
+        </w:tc>
+        <w:tc>
+          <w:tcPr>
+            <w:tcW w:type="dxa" w:w="4320"/>
+          </w:tcPr>
+          <w:p>
+            <w:r/>
+            <w:r>
+              <w:rPr>
+                <w:b w:val="0"/>
+                <w:sz w:val="18"/>
+              </w:rPr>
+              <w:t>?item_code=AF00890</w:t>
+            </w:r>
+          </w:p>
+        </w:tc>
+      </w:tr>
+      <w:tr>
+        <w:tc>
+          <w:tcPr>
+            <w:tcW w:type="dxa" w:w="4320"/>
+            <w:shd w:fill="F2F7FB"/>
+          </w:tcPr>
+          <w:p>
+            <w:r/>
+            <w:r>
+              <w:rPr>
+                <w:b w:val="0"/>
+                <w:sz w:val="18"/>
+              </w:rPr>
+              <w:t>By Customer</w:t>
+            </w:r>
+          </w:p>
+        </w:tc>
+        <w:tc>
+          <w:tcPr>
+            <w:tcW w:type="dxa" w:w="4320"/>
+            <w:shd w:fill="F2F7FB"/>
+          </w:tcPr>
+          <w:p>
+            <w:r/>
+            <w:r>
+              <w:rPr>
+                <w:b w:val="0"/>
+                <w:sz w:val="18"/>
+              </w:rPr>
+              <w:t>?customer=Vimal Store Cherthala</w:t>
+            </w:r>
+          </w:p>
+        </w:tc>
+      </w:tr>
+      <w:tr>
+        <w:tc>
+          <w:tcPr>
+            <w:tcW w:type="dxa" w:w="4320"/>
+          </w:tcPr>
+          <w:p>
+            <w:r/>
+            <w:r>
+              <w:rPr>
+                <w:b w:val="0"/>
+                <w:sz w:val="18"/>
+              </w:rPr>
+              <w:t>By Customer + DocType</w:t>
+            </w:r>
+          </w:p>
+        </w:tc>
+        <w:tc>
+          <w:tcPr>
+            <w:tcW w:type="dxa" w:w="4320"/>
+          </w:tcPr>
+          <w:p>
+            <w:r/>
+            <w:r>
+              <w:rPr>
+                <w:b w:val="0"/>
+                <w:sz w:val="18"/>
+              </w:rPr>
+              <w:t>?customer=Vimal Store Cherthala&amp;doctype=Sales Invoice</w:t>
+            </w:r>
+          </w:p>
+        </w:tc>
+      </w:tr>
+      <w:tr>
+        <w:tc>
+          <w:tcPr>
+            <w:tcW w:type="dxa" w:w="4320"/>
+            <w:shd w:fill="F2F7FB"/>
+          </w:tcPr>
+          <w:p>
+            <w:r/>
+            <w:r>
+              <w:rPr>
+                <w:b w:val="0"/>
+                <w:sz w:val="18"/>
+              </w:rPr>
+              <w:t>By Item + Customer</w:t>
+            </w:r>
+          </w:p>
+        </w:tc>
+        <w:tc>
+          <w:tcPr>
+            <w:tcW w:type="dxa" w:w="4320"/>
+            <w:shd w:fill="F2F7FB"/>
+          </w:tcPr>
+          <w:p>
+            <w:r/>
+            <w:r>
+              <w:rPr>
+                <w:b w:val="0"/>
+                <w:sz w:val="18"/>
+              </w:rPr>
+              <w:t>?item_code=AF00890&amp;customer=Vimal Store Cherthala</w:t>
+            </w:r>
+          </w:p>
+        </w:tc>
+      </w:tr>
+      <w:tr>
+        <w:tc>
+          <w:tcPr>
+            <w:tcW w:type="dxa" w:w="4320"/>
+          </w:tcPr>
+          <w:p>
+            <w:r/>
+            <w:r>
+              <w:rPr>
+                <w:b w:val="0"/>
+                <w:sz w:val="18"/>
+              </w:rPr>
+              <w:t>By Item + Date Range</w:t>
+            </w:r>
+          </w:p>
+        </w:tc>
+        <w:tc>
+          <w:tcPr>
+            <w:tcW w:type="dxa" w:w="4320"/>
+          </w:tcPr>
+          <w:p>
+            <w:r/>
+            <w:r>
+              <w:rPr>
+                <w:b w:val="0"/>
+                <w:sz w:val="18"/>
+              </w:rPr>
+              <w:t>?item_code=AF00890&amp;from_date=2026-01-01&amp;to_date=2026-03-25</w:t>
+            </w:r>
+          </w:p>
+        </w:tc>
+      </w:tr>
+      <w:tr>
+        <w:tc>
+          <w:tcPr>
+            <w:tcW w:type="dxa" w:w="4320"/>
+            <w:shd w:fill="F2F7FB"/>
+          </w:tcPr>
+          <w:p>
+            <w:r/>
+            <w:r>
+              <w:rPr>
+                <w:b w:val="0"/>
+                <w:sz w:val="18"/>
+              </w:rPr>
+              <w:t>Sales Returns Only</w:t>
+            </w:r>
+          </w:p>
+        </w:tc>
+        <w:tc>
+          <w:tcPr>
+            <w:tcW w:type="dxa" w:w="4320"/>
+            <w:shd w:fill="F2F7FB"/>
+          </w:tcPr>
+          <w:p>
+            <w:r/>
+            <w:r>
+              <w:rPr>
+                <w:b w:val="0"/>
+                <w:sz w:val="18"/>
+              </w:rPr>
+              <w:t>?customer=Vimal Store Cherthala&amp;doctype=Sales Return</w:t>
+            </w:r>
+          </w:p>
+        </w:tc>
+      </w:tr>
+    </w:tbl>
     <w:p>
       <w:r>
         <w:br w:type="page"/>

</xml_diff>